<commit_message>
docs(gsc): fold priority-upload into functional-spec §6.12; api, user-guide, TODO
Per-item completion for the GSC priority-upload feature:
- functional-specification.md §6.12 — the contract, (i)+(ii) flows, guards, deferred scope.
- api.md — /start `gsc_priority` field + INVALID_PRIORITY_FILE.
- user-guide.md — "Attaching a GSC priority file (optional)"; regenerated user-guide.md.docx.
- TODO.md — deferred: rich PerformanceBundle (GA4/index/GTM) + seed freshness.
- Deleted docs/pending/2026-08-14_gsc-performance-handoff-plan.md (folded).

Co-Authored-By: Claude Opus 4.8 <noreply@anthropic.com>
</commit_message>
<xml_diff>
--- a/user-guide.md.docx
+++ b/user-guide.md.docx
@@ -2,7 +2,7 @@
 <file path=word/document.xml><?xml version="1.0" encoding="utf-8"?>
 <w:document xmlns:w="http://schemas.openxmlformats.org/wordprocessingml/2006/main" xmlns:m="http://schemas.openxmlformats.org/officeDocument/2006/math" xmlns:r="http://schemas.openxmlformats.org/officeDocument/2006/relationships" xmlns:o="urn:schemas-microsoft-com:office:office" xmlns:v="urn:schemas-microsoft-com:vml" xmlns:w10="urn:schemas-microsoft-com:office:word" xmlns:a="http://schemas.openxmlformats.org/drawingml/2006/main" xmlns:pic="http://schemas.openxmlformats.org/drawingml/2006/picture" xmlns:wp="http://schemas.openxmlformats.org/drawingml/2006/wordprocessingDrawing">
   <w:body>
-    <w:bookmarkStart w:id="38" w:name="user-guide-talkingtoad-seo-crawler"/>
+    <w:bookmarkStart w:id="39" w:name="user-guide-talkingtoad-seo-crawler"/>
     <w:p>
       <w:pPr>
         <w:pStyle w:val="Heading1"/>
@@ -36,7 +36,7 @@
       </w:r>
     </w:p>
     <w:bookmarkEnd w:id="9"/>
-    <w:bookmarkStart w:id="11" w:name="how-to-run-a-check"/>
+    <w:bookmarkStart w:id="12" w:name="how-to-run-a-check"/>
     <w:p>
       <w:pPr>
         <w:pStyle w:val="Heading2"/>
@@ -208,6 +208,156 @@
         <w:t xml:space="preserve">This is useful for verifying that a fix worked without running a full re-crawl.</w:t>
       </w:r>
     </w:p>
+    <w:bookmarkEnd w:id="10"/>
+    <w:bookmarkStart w:id="11" w:name="attaching-a-gsc-priority-file-optional"/>
+    <w:p>
+      <w:pPr>
+        <w:pStyle w:val="Heading3"/>
+      </w:pPr>
+      <w:r>
+        <w:t xml:space="preserve">Attaching a GSC priority file (optional)</w:t>
+      </w:r>
+    </w:p>
+    <w:p>
+      <w:pPr>
+        <w:pStyle w:val="FirstParagraph"/>
+      </w:pPr>
+      <w:r>
+        <w:t xml:space="preserve">If you use the companion</w:t>
+      </w:r>
+      <w:r>
+        <w:t xml:space="preserve"> </w:t>
+      </w:r>
+      <w:r>
+        <w:rPr>
+          <w:b/>
+          <w:bCs/>
+        </w:rPr>
+        <w:t xml:space="preserve">GSC reporting app</w:t>
+      </w:r>
+      <w:r>
+        <w:t xml:space="preserve">, it produces a</w:t>
+      </w:r>
+      <w:r>
+        <w:t xml:space="preserve"> </w:t>
+      </w:r>
+      <w:r>
+        <w:rPr>
+          <w:rStyle w:val="VerbatimChar"/>
+        </w:rPr>
+        <w:t xml:space="preserve">priority_pages.json</w:t>
+      </w:r>
+      <w:r>
+        <w:t xml:space="preserve"> </w:t>
+      </w:r>
+      <w:r>
+        <w:t xml:space="preserve">listing your</w:t>
+      </w:r>
+      <w:r>
+        <w:t xml:space="preserve"> </w:t>
+      </w:r>
+      <w:r>
+        <w:t xml:space="preserve">highest-traffic pages with their Search Console numbers. On the scan-start screen you can attach</w:t>
+      </w:r>
+      <w:r>
+        <w:t xml:space="preserve"> </w:t>
+      </w:r>
+      <w:r>
+        <w:t xml:space="preserve">that file (the</w:t>
+      </w:r>
+      <w:r>
+        <w:t xml:space="preserve"> </w:t>
+      </w:r>
+      <w:r>
+        <w:rPr>
+          <w:b/>
+          <w:bCs/>
+        </w:rPr>
+        <w:t xml:space="preserve">“GSC priority file”</w:t>
+      </w:r>
+      <w:r>
+        <w:t xml:space="preserve"> </w:t>
+      </w:r>
+      <w:r>
+        <w:t xml:space="preserve">box). When you do, TalkingToad:</w:t>
+      </w:r>
+    </w:p>
+    <w:p>
+      <w:pPr>
+        <w:pStyle w:val="Compact"/>
+        <w:numPr>
+          <w:ilvl w:val="0"/>
+          <w:numId w:val="1002"/>
+        </w:numPr>
+      </w:pPr>
+      <w:r>
+        <w:rPr>
+          <w:b/>
+          <w:bCs/>
+        </w:rPr>
+        <w:t xml:space="preserve">scans your most important pages first</w:t>
+      </w:r>
+      <w:r>
+        <w:t xml:space="preserve"> </w:t>
+      </w:r>
+      <w:r>
+        <w:t xml:space="preserve">(rather than crawling in whatever order it discovers</w:t>
+      </w:r>
+      <w:r>
+        <w:t xml:space="preserve"> </w:t>
+      </w:r>
+      <w:r>
+        <w:t xml:space="preserve">links), and</w:t>
+      </w:r>
+    </w:p>
+    <w:p>
+      <w:pPr>
+        <w:pStyle w:val="Compact"/>
+        <w:numPr>
+          <w:ilvl w:val="0"/>
+          <w:numId w:val="1002"/>
+        </w:numPr>
+      </w:pPr>
+      <w:r>
+        <w:rPr>
+          <w:b/>
+          <w:bCs/>
+        </w:rPr>
+        <w:t xml:space="preserve">ranks the results using your Search Console data</w:t>
+      </w:r>
+      <w:r>
+        <w:t xml:space="preserve"> </w:t>
+      </w:r>
+      <w:r>
+        <w:t xml:space="preserve">(clicks, impressions, position, inquiries),</w:t>
+      </w:r>
+      <w:r>
+        <w:t xml:space="preserve"> </w:t>
+      </w:r>
+      <w:r>
+        <w:t xml:space="preserve">so the Page Priority queue reflects what actually earns traffic.</w:t>
+      </w:r>
+    </w:p>
+    <w:p>
+      <w:pPr>
+        <w:pStyle w:val="FirstParagraph"/>
+      </w:pPr>
+      <w:r>
+        <w:t xml:space="preserve">It’s entirely optional — leave it empty and the scan runs exactly as before. The file is read in</w:t>
+      </w:r>
+      <w:r>
+        <w:t xml:space="preserve"> </w:t>
+      </w:r>
+      <w:r>
+        <w:t xml:space="preserve">your browser and sent with the scan; TalkingToad never reaches into your computer’s files. If you</w:t>
+      </w:r>
+      <w:r>
+        <w:t xml:space="preserve"> </w:t>
+      </w:r>
+      <w:r>
+        <w:t xml:space="preserve">attach the wrong site’s file, the scan tells you and ignores it.</w:t>
+      </w:r>
+    </w:p>
     <w:p>
       <w:r>
         <w:pict>
@@ -215,9 +365,9 @@
         </w:pict>
       </w:r>
     </w:p>
-    <w:bookmarkEnd w:id="10"/>
     <w:bookmarkEnd w:id="11"/>
-    <w:bookmarkStart w:id="12" w:name="choosing-what-to-check"/>
+    <w:bookmarkEnd w:id="12"/>
+    <w:bookmarkStart w:id="13" w:name="choosing-what-to-check"/>
     <w:p>
       <w:pPr>
         <w:pStyle w:val="Heading2"/>
@@ -424,8 +574,8 @@
         </w:pict>
       </w:r>
     </w:p>
-    <w:bookmarkEnd w:id="12"/>
-    <w:bookmarkStart w:id="24" w:name="understanding-the-results"/>
+    <w:bookmarkEnd w:id="13"/>
+    <w:bookmarkStart w:id="25" w:name="understanding-the-results"/>
     <w:p>
       <w:pPr>
         <w:pStyle w:val="Heading2"/>
@@ -434,7 +584,7 @@
         <w:t xml:space="preserve">Understanding the Results</w:t>
       </w:r>
     </w:p>
-    <w:bookmarkStart w:id="13" w:name="health-score"/>
+    <w:bookmarkStart w:id="14" w:name="health-score"/>
     <w:p>
       <w:pPr>
         <w:pStyle w:val="Heading3"/>
@@ -541,8 +691,8 @@
         <w:t xml:space="preserve">The score is reduced by issue impacts — critical issues reduce it the most.</w:t>
       </w:r>
     </w:p>
-    <w:bookmarkEnd w:id="13"/>
-    <w:bookmarkStart w:id="14" w:name="agent-health-score"/>
+    <w:bookmarkEnd w:id="14"/>
+    <w:bookmarkStart w:id="15" w:name="agent-health-score"/>
     <w:p>
       <w:pPr>
         <w:pStyle w:val="Heading3"/>
@@ -663,8 +813,8 @@
         <w:t xml:space="preserve">harder for AI tools to use — worth fixing as AI search grows.</w:t>
       </w:r>
     </w:p>
-    <w:bookmarkEnd w:id="14"/>
-    <w:bookmarkStart w:id="17" w:name="issue-categories"/>
+    <w:bookmarkEnd w:id="15"/>
+    <w:bookmarkStart w:id="18" w:name="issue-categories"/>
     <w:p>
       <w:pPr>
         <w:pStyle w:val="Heading3"/>
@@ -1080,7 +1230,7 @@
         </w:tc>
       </w:tr>
     </w:tbl>
-    <w:bookmarkStart w:id="15" w:name="noindex-pages"/>
+    <w:bookmarkStart w:id="16" w:name="noindex-pages"/>
     <w:p>
       <w:pPr>
         <w:pStyle w:val="Heading4"/>
@@ -1113,8 +1263,8 @@
         <w:t xml:space="preserve">are deliberately hidden from search engines, so TalkingToad does not penalise them for content or SEO issues — the only finding reported for such a page is the noindex tag itself. This keeps intentionally-hidden pages (thank-you pages, staging drafts) from cluttering your results with fixes you don’t need.</w:t>
       </w:r>
     </w:p>
-    <w:bookmarkEnd w:id="15"/>
-    <w:bookmarkStart w:id="16" w:name="site-wide-issues-counted-once"/>
+    <w:bookmarkEnd w:id="16"/>
+    <w:bookmarkStart w:id="17" w:name="site-wide-issues-counted-once"/>
     <w:p>
       <w:pPr>
         <w:pStyle w:val="Heading4"/>
@@ -1199,9 +1349,9 @@
         <w:t xml:space="preserve">, not once per page, so a single misconfiguration doesn’t inflate your issue total across hundreds of pages.</w:t>
       </w:r>
     </w:p>
-    <w:bookmarkEnd w:id="16"/>
     <w:bookmarkEnd w:id="17"/>
-    <w:bookmarkStart w:id="18" w:name="top-5-priority-fixes"/>
+    <w:bookmarkEnd w:id="18"/>
+    <w:bookmarkStart w:id="19" w:name="top-5-priority-fixes"/>
     <w:p>
       <w:pPr>
         <w:pStyle w:val="Heading3"/>
@@ -1250,8 +1400,8 @@
         <w:t xml:space="preserve">score (how hard it is to fix). The priority ranking combines both.</w:t>
       </w:r>
     </w:p>
-    <w:bookmarkEnd w:id="18"/>
-    <w:bookmarkStart w:id="19" w:name="fix-focus-checklist"/>
+    <w:bookmarkEnd w:id="19"/>
+    <w:bookmarkStart w:id="20" w:name="fix-focus-checklist"/>
     <w:p>
       <w:pPr>
         <w:pStyle w:val="Heading3"/>
@@ -1330,362 +1480,6 @@
       </w:r>
       <w:r>
         <w:t xml:space="preserve">tag marks the easy, high-value items.</w:t>
-      </w:r>
-    </w:p>
-    <w:p>
-      <w:pPr>
-        <w:pStyle w:val="Compact"/>
-        <w:numPr>
-          <w:ilvl w:val="0"/>
-          <w:numId w:val="1002"/>
-        </w:numPr>
-      </w:pPr>
-      <w:r>
-        <w:rPr>
-          <w:b/>
-          <w:bCs/>
-        </w:rPr>
-        <w:t xml:space="preserve">Tick items off as you fix them.</w:t>
-      </w:r>
-      <w:r>
-        <w:t xml:space="preserve"> </w:t>
-      </w:r>
-      <w:r>
-        <w:t xml:space="preserve">Your ticks are</w:t>
-      </w:r>
-      <w:r>
-        <w:t xml:space="preserve"> </w:t>
-      </w:r>
-      <w:r>
-        <w:rPr>
-          <w:b/>
-          <w:bCs/>
-        </w:rPr>
-        <w:t xml:space="preserve">saved with the crawl</w:t>
-      </w:r>
-      <w:r>
-        <w:t xml:space="preserve">, so you can leave and come back without re-running the scan.</w:t>
-      </w:r>
-    </w:p>
-    <w:p>
-      <w:pPr>
-        <w:pStyle w:val="Compact"/>
-        <w:numPr>
-          <w:ilvl w:val="0"/>
-          <w:numId w:val="1002"/>
-        </w:numPr>
-      </w:pPr>
-      <w:r>
-        <w:rPr>
-          <w:b/>
-          <w:bCs/>
-        </w:rPr>
-        <w:t xml:space="preserve">Verify a page.</w:t>
-      </w:r>
-      <w:r>
-        <w:t xml:space="preserve"> </w:t>
-      </w:r>
-      <w:r>
-        <w:t xml:space="preserve">After you’ve fixed something, click</w:t>
-      </w:r>
-      <w:r>
-        <w:t xml:space="preserve"> </w:t>
-      </w:r>
-      <w:r>
-        <w:rPr>
-          <w:b/>
-          <w:bCs/>
-        </w:rPr>
-        <w:t xml:space="preserve">Verify page</w:t>
-      </w:r>
-      <w:r>
-        <w:t xml:space="preserve"> </w:t>
-      </w:r>
-      <w:r>
-        <w:t xml:space="preserve">on that page. TalkingToad re-scans just that one page: items it confirms are gone turn</w:t>
-      </w:r>
-      <w:r>
-        <w:t xml:space="preserve"> </w:t>
-      </w:r>
-      <w:r>
-        <w:rPr>
-          <w:b/>
-          <w:bCs/>
-        </w:rPr>
-        <w:t xml:space="preserve">verified</w:t>
-      </w:r>
-      <w:r>
-        <w:t xml:space="preserve">, and anything still there is flagged</w:t>
-      </w:r>
-      <w:r>
-        <w:t xml:space="preserve"> </w:t>
-      </w:r>
-      <w:r>
-        <w:rPr>
-          <w:b/>
-          <w:bCs/>
-        </w:rPr>
-        <w:t xml:space="preserve">still present</w:t>
-      </w:r>
-      <w:r>
-        <w:t xml:space="preserve"> </w:t>
-      </w:r>
-      <w:r>
-        <w:t xml:space="preserve">so a not-quite-fixed item doesn’t quietly look done. (A page that’s erroring — returning a 4xx/5xx — is not marked verified.)</w:t>
-      </w:r>
-    </w:p>
-    <w:p>
-      <w:pPr>
-        <w:pStyle w:val="Compact"/>
-        <w:numPr>
-          <w:ilvl w:val="0"/>
-          <w:numId w:val="1002"/>
-        </w:numPr>
-      </w:pPr>
-      <w:r>
-        <w:rPr>
-          <w:b/>
-          <w:bCs/>
-        </w:rPr>
-        <w:t xml:space="preserve">Regenerate</w:t>
-      </w:r>
-      <w:r>
-        <w:t xml:space="preserve"> </w:t>
-      </w:r>
-      <w:r>
-        <w:t xml:space="preserve">rebuilds the list from your latest scan while keeping the ticks on items that still apply. Use it after you’ve fixed a batch, or when Verify tells you new issues appeared on a page.</w:t>
-      </w:r>
-    </w:p>
-    <w:p>
-      <w:pPr>
-        <w:pStyle w:val="FirstParagraph"/>
-      </w:pPr>
-      <w:r>
-        <w:t xml:space="preserve">Next to Fix Focus is a</w:t>
-      </w:r>
-      <w:r>
-        <w:t xml:space="preserve"> </w:t>
-      </w:r>
-      <w:r>
-        <w:rPr>
-          <w:b/>
-          <w:bCs/>
-        </w:rPr>
-        <w:t xml:space="preserve">Fix Focus Items Help</w:t>
-      </w:r>
-      <w:r>
-        <w:t xml:space="preserve"> </w:t>
-      </w:r>
-      <w:r>
-        <w:t xml:space="preserve">panel — a plain-English glossary for the items on your list. Each distinct item is explained</w:t>
-      </w:r>
-      <w:r>
-        <w:t xml:space="preserve"> </w:t>
-      </w:r>
-      <w:r>
-        <w:rPr>
-          <w:b/>
-          <w:bCs/>
-        </w:rPr>
-        <w:t xml:space="preserve">once</w:t>
-      </w:r>
-      <w:r>
-        <w:t xml:space="preserve"> </w:t>
-      </w:r>
-      <w:r>
-        <w:t xml:space="preserve">(so an item that appears on many pages isn’t repeated), listed</w:t>
-      </w:r>
-      <w:r>
-        <w:t xml:space="preserve"> </w:t>
-      </w:r>
-      <w:r>
-        <w:rPr>
-          <w:b/>
-          <w:bCs/>
-        </w:rPr>
-        <w:t xml:space="preserve">A–Z</w:t>
-      </w:r>
-      <w:r>
-        <w:t xml:space="preserve"> </w:t>
-      </w:r>
-      <w:r>
-        <w:t xml:space="preserve">by the same name shown on the checklist, with what it is and how to fix it. Fix Focus is also available as its own</w:t>
-      </w:r>
-      <w:r>
-        <w:t xml:space="preserve"> </w:t>
-      </w:r>
-      <w:r>
-        <w:rPr>
-          <w:b/>
-          <w:bCs/>
-        </w:rPr>
-        <w:t xml:space="preserve">Fix Focus</w:t>
-      </w:r>
-      <w:r>
-        <w:t xml:space="preserve"> </w:t>
-      </w:r>
-      <w:r>
-        <w:t xml:space="preserve">tab if you want the full-width view.</w:t>
-      </w:r>
-    </w:p>
-    <w:bookmarkEnd w:id="19"/>
-    <w:bookmarkStart w:id="20" w:name="quick-wins"/>
-    <w:p>
-      <w:pPr>
-        <w:pStyle w:val="Heading3"/>
-      </w:pPr>
-      <w:r>
-        <w:t xml:space="preserve">Quick Wins</w:t>
-      </w:r>
-    </w:p>
-    <w:p>
-      <w:pPr>
-        <w:pStyle w:val="FirstParagraph"/>
-      </w:pPr>
-      <w:r>
-        <w:t xml:space="preserve">Alongside the priority list you’ll see a separate</w:t>
-      </w:r>
-      <w:r>
-        <w:t xml:space="preserve"> </w:t>
-      </w:r>
-      <w:r>
-        <w:rPr>
-          <w:b/>
-          <w:bCs/>
-        </w:rPr>
-        <w:t xml:space="preserve">Quick Wins</w:t>
-      </w:r>
-      <w:r>
-        <w:t xml:space="preserve"> </w:t>
-      </w:r>
-      <w:r>
-        <w:t xml:space="preserve">list. These are issues that are both</w:t>
-      </w:r>
-      <w:r>
-        <w:t xml:space="preserve"> </w:t>
-      </w:r>
-      <w:r>
-        <w:rPr>
-          <w:b/>
-          <w:bCs/>
-        </w:rPr>
-        <w:t xml:space="preserve">high impact</w:t>
-      </w:r>
-      <w:r>
-        <w:t xml:space="preserve"> </w:t>
-      </w:r>
-      <w:r>
-        <w:t xml:space="preserve">and</w:t>
-      </w:r>
-      <w:r>
-        <w:t xml:space="preserve"> </w:t>
-      </w:r>
-      <w:r>
-        <w:rPr>
-          <w:b/>
-          <w:bCs/>
-        </w:rPr>
-        <w:t xml:space="preserve">low effort</w:t>
-      </w:r>
-      <w:r>
-        <w:t xml:space="preserve"> </w:t>
-      </w:r>
-      <w:r>
-        <w:t xml:space="preserve">— the easy, high-value fixes that give you the most improvement for the least work. Quick Wins are picked independently of the priority ranking, so it’s worth scanning this list even after you’ve worked through your Top Priority Fixes.</w:t>
-      </w:r>
-    </w:p>
-    <w:bookmarkEnd w:id="20"/>
-    <w:bookmarkStart w:id="21" w:name="severity-colours"/>
-    <w:p>
-      <w:pPr>
-        <w:pStyle w:val="Heading3"/>
-      </w:pPr>
-      <w:r>
-        <w:t xml:space="preserve">Severity Colours</w:t>
-      </w:r>
-    </w:p>
-    <w:p>
-      <w:pPr>
-        <w:pStyle w:val="FirstParagraph"/>
-      </w:pPr>
-      <w:r>
-        <w:t xml:space="preserve">After the 2026-07 severity recalibration, most issues now surface as</w:t>
-      </w:r>
-      <w:r>
-        <w:t xml:space="preserve"> </w:t>
-      </w:r>
-      <w:r>
-        <w:rPr>
-          <w:b/>
-          <w:bCs/>
-        </w:rPr>
-        <w:t xml:space="preserve">Info</w:t>
-      </w:r>
-      <w:r>
-        <w:t xml:space="preserve"> </w:t>
-      </w:r>
-      <w:r>
-        <w:t xml:space="preserve">— only page-fatal problems (such as</w:t>
-      </w:r>
-      <w:r>
-        <w:t xml:space="preserve"> </w:t>
-      </w:r>
-      <w:r>
-        <w:rPr>
-          <w:rStyle w:val="VerbatimChar"/>
-        </w:rPr>
-        <w:t xml:space="preserve">noindex</w:t>
-      </w:r>
-      <w:r>
-        <w:t xml:space="preserve"> </w:t>
-      </w:r>
-      <w:r>
-        <w:t xml:space="preserve">on a page you want indexed, or redirect loops) remain</w:t>
-      </w:r>
-      <w:r>
-        <w:t xml:space="preserve"> </w:t>
-      </w:r>
-      <w:r>
-        <w:rPr>
-          <w:b/>
-          <w:bCs/>
-        </w:rPr>
-        <w:t xml:space="preserve">Critical</w:t>
-      </w:r>
-      <w:r>
-        <w:t xml:space="preserve">.</w:t>
-      </w:r>
-      <w:r>
-        <w:t xml:space="preserve"> </w:t>
-      </w:r>
-      <w:r>
-        <w:rPr>
-          <w:b/>
-          <w:bCs/>
-        </w:rPr>
-        <w:t xml:space="preserve">Broken links</w:t>
-      </w:r>
-      <w:r>
-        <w:t xml:space="preserve"> </w:t>
-      </w:r>
-      <w:r>
-        <w:t xml:space="preserve">are now scored as</w:t>
-      </w:r>
-      <w:r>
-        <w:t xml:space="preserve"> </w:t>
-      </w:r>
-      <w:r>
-        <w:rPr>
-          <w:b/>
-          <w:bCs/>
-        </w:rPr>
-        <w:t xml:space="preserve">minor</w:t>
-      </w:r>
-      <w:r>
-        <w:t xml:space="preserve"> </w:t>
-      </w:r>
-      <w:r>
-        <w:t xml:space="preserve">(low impact) rather than critical: they’re worth fixing, but they rarely sink your search visibility on their own.</w:t>
       </w:r>
     </w:p>
     <w:p>
@@ -1697,23 +1491,30 @@
         </w:numPr>
       </w:pPr>
       <w:r>
-        <w:t xml:space="preserve">🔴</w:t>
-      </w:r>
-      <w:r>
-        <w:t xml:space="preserve"> </w:t>
-      </w:r>
-      <w:r>
-        <w:rPr>
-          <w:b/>
-          <w:bCs/>
-        </w:rPr>
-        <w:t xml:space="preserve">Critical</w:t>
-      </w:r>
-      <w:r>
-        <w:t xml:space="preserve"> </w:t>
-      </w:r>
-      <w:r>
-        <w:t xml:space="preserve">— Fix these first; they directly harm your search visibility (reserved for page-fatal problems)</w:t>
+        <w:rPr>
+          <w:b/>
+          <w:bCs/>
+        </w:rPr>
+        <w:t xml:space="preserve">Tick items off as you fix them.</w:t>
+      </w:r>
+      <w:r>
+        <w:t xml:space="preserve"> </w:t>
+      </w:r>
+      <w:r>
+        <w:t xml:space="preserve">Your ticks are</w:t>
+      </w:r>
+      <w:r>
+        <w:t xml:space="preserve"> </w:t>
+      </w:r>
+      <w:r>
+        <w:rPr>
+          <w:b/>
+          <w:bCs/>
+        </w:rPr>
+        <w:t xml:space="preserve">saved with the crawl</w:t>
+      </w:r>
+      <w:r>
+        <w:t xml:space="preserve">, so you can leave and come back without re-running the scan.</w:t>
       </w:r>
     </w:p>
     <w:p>
@@ -1725,23 +1526,62 @@
         </w:numPr>
       </w:pPr>
       <w:r>
-        <w:t xml:space="preserve">🟡</w:t>
-      </w:r>
-      <w:r>
-        <w:t xml:space="preserve"> </w:t>
-      </w:r>
-      <w:r>
-        <w:rPr>
-          <w:b/>
-          <w:bCs/>
-        </w:rPr>
-        <w:t xml:space="preserve">Warning</w:t>
-      </w:r>
-      <w:r>
-        <w:t xml:space="preserve"> </w:t>
-      </w:r>
-      <w:r>
-        <w:t xml:space="preserve">— Should be fixed; will improve your results</w:t>
+        <w:rPr>
+          <w:b/>
+          <w:bCs/>
+        </w:rPr>
+        <w:t xml:space="preserve">Verify a page.</w:t>
+      </w:r>
+      <w:r>
+        <w:t xml:space="preserve"> </w:t>
+      </w:r>
+      <w:r>
+        <w:t xml:space="preserve">After you’ve fixed something, click</w:t>
+      </w:r>
+      <w:r>
+        <w:t xml:space="preserve"> </w:t>
+      </w:r>
+      <w:r>
+        <w:rPr>
+          <w:b/>
+          <w:bCs/>
+        </w:rPr>
+        <w:t xml:space="preserve">Verify page</w:t>
+      </w:r>
+      <w:r>
+        <w:t xml:space="preserve"> </w:t>
+      </w:r>
+      <w:r>
+        <w:t xml:space="preserve">on that page. TalkingToad re-scans just that one page: items it confirms are gone turn</w:t>
+      </w:r>
+      <w:r>
+        <w:t xml:space="preserve"> </w:t>
+      </w:r>
+      <w:r>
+        <w:rPr>
+          <w:b/>
+          <w:bCs/>
+        </w:rPr>
+        <w:t xml:space="preserve">verified</w:t>
+      </w:r>
+      <w:r>
+        <w:t xml:space="preserve">, and anything still there is flagged</w:t>
+      </w:r>
+      <w:r>
+        <w:t xml:space="preserve"> </w:t>
+      </w:r>
+      <w:r>
+        <w:rPr>
+          <w:b/>
+          <w:bCs/>
+        </w:rPr>
+        <w:t xml:space="preserve">still present</w:t>
+      </w:r>
+      <w:r>
+        <w:t xml:space="preserve"> </w:t>
+      </w:r>
+      <w:r>
+        <w:t xml:space="preserve">so a not-quite-fixed item doesn’t quietly look done. (A page that’s erroring — returning a 4xx/5xx — is not marked verified.)</w:t>
       </w:r>
     </w:p>
     <w:p>
@@ -1753,7 +1593,173 @@
         </w:numPr>
       </w:pPr>
       <w:r>
-        <w:t xml:space="preserve">🔵</w:t>
+        <w:rPr>
+          <w:b/>
+          <w:bCs/>
+        </w:rPr>
+        <w:t xml:space="preserve">Regenerate</w:t>
+      </w:r>
+      <w:r>
+        <w:t xml:space="preserve"> </w:t>
+      </w:r>
+      <w:r>
+        <w:t xml:space="preserve">rebuilds the list from your latest scan while keeping the ticks on items that still apply. Use it after you’ve fixed a batch, or when Verify tells you new issues appeared on a page.</w:t>
+      </w:r>
+    </w:p>
+    <w:p>
+      <w:pPr>
+        <w:pStyle w:val="FirstParagraph"/>
+      </w:pPr>
+      <w:r>
+        <w:t xml:space="preserve">Next to Fix Focus is a</w:t>
+      </w:r>
+      <w:r>
+        <w:t xml:space="preserve"> </w:t>
+      </w:r>
+      <w:r>
+        <w:rPr>
+          <w:b/>
+          <w:bCs/>
+        </w:rPr>
+        <w:t xml:space="preserve">Fix Focus Items Help</w:t>
+      </w:r>
+      <w:r>
+        <w:t xml:space="preserve"> </w:t>
+      </w:r>
+      <w:r>
+        <w:t xml:space="preserve">panel — a plain-English glossary for the items on your list. Each distinct item is explained</w:t>
+      </w:r>
+      <w:r>
+        <w:t xml:space="preserve"> </w:t>
+      </w:r>
+      <w:r>
+        <w:rPr>
+          <w:b/>
+          <w:bCs/>
+        </w:rPr>
+        <w:t xml:space="preserve">once</w:t>
+      </w:r>
+      <w:r>
+        <w:t xml:space="preserve"> </w:t>
+      </w:r>
+      <w:r>
+        <w:t xml:space="preserve">(so an item that appears on many pages isn’t repeated), listed</w:t>
+      </w:r>
+      <w:r>
+        <w:t xml:space="preserve"> </w:t>
+      </w:r>
+      <w:r>
+        <w:rPr>
+          <w:b/>
+          <w:bCs/>
+        </w:rPr>
+        <w:t xml:space="preserve">A–Z</w:t>
+      </w:r>
+      <w:r>
+        <w:t xml:space="preserve"> </w:t>
+      </w:r>
+      <w:r>
+        <w:t xml:space="preserve">by the same name shown on the checklist, with what it is and how to fix it. Fix Focus is also available as its own</w:t>
+      </w:r>
+      <w:r>
+        <w:t xml:space="preserve"> </w:t>
+      </w:r>
+      <w:r>
+        <w:rPr>
+          <w:b/>
+          <w:bCs/>
+        </w:rPr>
+        <w:t xml:space="preserve">Fix Focus</w:t>
+      </w:r>
+      <w:r>
+        <w:t xml:space="preserve"> </w:t>
+      </w:r>
+      <w:r>
+        <w:t xml:space="preserve">tab if you want the full-width view.</w:t>
+      </w:r>
+    </w:p>
+    <w:bookmarkEnd w:id="20"/>
+    <w:bookmarkStart w:id="21" w:name="quick-wins"/>
+    <w:p>
+      <w:pPr>
+        <w:pStyle w:val="Heading3"/>
+      </w:pPr>
+      <w:r>
+        <w:t xml:space="preserve">Quick Wins</w:t>
+      </w:r>
+    </w:p>
+    <w:p>
+      <w:pPr>
+        <w:pStyle w:val="FirstParagraph"/>
+      </w:pPr>
+      <w:r>
+        <w:t xml:space="preserve">Alongside the priority list you’ll see a separate</w:t>
+      </w:r>
+      <w:r>
+        <w:t xml:space="preserve"> </w:t>
+      </w:r>
+      <w:r>
+        <w:rPr>
+          <w:b/>
+          <w:bCs/>
+        </w:rPr>
+        <w:t xml:space="preserve">Quick Wins</w:t>
+      </w:r>
+      <w:r>
+        <w:t xml:space="preserve"> </w:t>
+      </w:r>
+      <w:r>
+        <w:t xml:space="preserve">list. These are issues that are both</w:t>
+      </w:r>
+      <w:r>
+        <w:t xml:space="preserve"> </w:t>
+      </w:r>
+      <w:r>
+        <w:rPr>
+          <w:b/>
+          <w:bCs/>
+        </w:rPr>
+        <w:t xml:space="preserve">high impact</w:t>
+      </w:r>
+      <w:r>
+        <w:t xml:space="preserve"> </w:t>
+      </w:r>
+      <w:r>
+        <w:t xml:space="preserve">and</w:t>
+      </w:r>
+      <w:r>
+        <w:t xml:space="preserve"> </w:t>
+      </w:r>
+      <w:r>
+        <w:rPr>
+          <w:b/>
+          <w:bCs/>
+        </w:rPr>
+        <w:t xml:space="preserve">low effort</w:t>
+      </w:r>
+      <w:r>
+        <w:t xml:space="preserve"> </w:t>
+      </w:r>
+      <w:r>
+        <w:t xml:space="preserve">— the easy, high-value fixes that give you the most improvement for the least work. Quick Wins are picked independently of the priority ranking, so it’s worth scanning this list even after you’ve worked through your Top Priority Fixes.</w:t>
+      </w:r>
+    </w:p>
+    <w:bookmarkEnd w:id="21"/>
+    <w:bookmarkStart w:id="22" w:name="severity-colours"/>
+    <w:p>
+      <w:pPr>
+        <w:pStyle w:val="Heading3"/>
+      </w:pPr>
+      <w:r>
+        <w:t xml:space="preserve">Severity Colours</w:t>
+      </w:r>
+    </w:p>
+    <w:p>
+      <w:pPr>
+        <w:pStyle w:val="FirstParagraph"/>
+      </w:pPr>
+      <w:r>
+        <w:t xml:space="preserve">After the 2026-07 severity recalibration, most issues now surface as</w:t>
       </w:r>
       <w:r>
         <w:t xml:space="preserve"> </w:t>
@@ -1769,99 +1775,7 @@
         <w:t xml:space="preserve"> </w:t>
       </w:r>
       <w:r>
-        <w:t xml:space="preserve">— Worth knowing; low urgency</w:t>
-      </w:r>
-    </w:p>
-    <w:bookmarkEnd w:id="21"/>
-    <w:bookmarkStart w:id="22" w:name="page-priority-queue"/>
-    <w:p>
-      <w:pPr>
-        <w:pStyle w:val="Heading3"/>
-      </w:pPr>
-      <w:r>
-        <w:t xml:space="preserve">Page Priority queue</w:t>
-      </w:r>
-    </w:p>
-    <w:p>
-      <w:pPr>
-        <w:pStyle w:val="FirstParagraph"/>
-      </w:pPr>
-      <w:r>
-        <w:t xml:space="preserve">The</w:t>
-      </w:r>
-      <w:r>
-        <w:t xml:space="preserve"> </w:t>
-      </w:r>
-      <w:r>
-        <w:rPr>
-          <w:b/>
-          <w:bCs/>
-        </w:rPr>
-        <w:t xml:space="preserve">Page Priority</w:t>
-      </w:r>
-      <w:r>
-        <w:t xml:space="preserve"> </w:t>
-      </w:r>
-      <w:r>
-        <w:t xml:space="preserve">panel ranks the crawled pages so you know which ones to work on first. When you’re done reviewing the ranked list, click</w:t>
-      </w:r>
-      <w:r>
-        <w:t xml:space="preserve"> </w:t>
-      </w:r>
-      <w:r>
-        <w:rPr>
-          <w:b/>
-          <w:bCs/>
-        </w:rPr>
-        <w:t xml:space="preserve">Hide</w:t>
-      </w:r>
-      <w:r>
-        <w:t xml:space="preserve"> </w:t>
-      </w:r>
-      <w:r>
-        <w:t xml:space="preserve">to collapse it and clear the table; re-opening the panel re-ranks the pages honestly from the current crawl. (The button used to read</w:t>
-      </w:r>
-      <w:r>
-        <w:t xml:space="preserve"> </w:t>
-      </w:r>
-      <w:r>
-        <w:t xml:space="preserve">“Refresh”</w:t>
-      </w:r>
-      <w:r>
-        <w:t xml:space="preserve"> </w:t>
-      </w:r>
-      <w:r>
-        <w:t xml:space="preserve">but only re-displayed the same crawl’s numbers without re-scanning —</w:t>
-      </w:r>
-      <w:r>
-        <w:t xml:space="preserve"> </w:t>
-      </w:r>
-      <w:r>
-        <w:t xml:space="preserve">“Hide”</w:t>
-      </w:r>
-      <w:r>
-        <w:t xml:space="preserve"> </w:t>
-      </w:r>
-      <w:r>
-        <w:t xml:space="preserve">makes what it does clear.)</w:t>
-      </w:r>
-    </w:p>
-    <w:bookmarkEnd w:id="22"/>
-    <w:bookmarkStart w:id="23" w:name="llms.txt-validation"/>
-    <w:p>
-      <w:pPr>
-        <w:pStyle w:val="Heading3"/>
-      </w:pPr>
-      <w:r>
-        <w:t xml:space="preserve">llms.txt validation</w:t>
-      </w:r>
-    </w:p>
-    <w:p>
-      <w:pPr>
-        <w:pStyle w:val="FirstParagraph"/>
-      </w:pPr>
-      <w:r>
-        <w:t xml:space="preserve">If your site publishes an</w:t>
+        <w:t xml:space="preserve">— only page-fatal problems (such as</w:t>
       </w:r>
       <w:r>
         <w:t xml:space="preserve"> </w:t>
@@ -1870,99 +1784,58 @@
         <w:rPr>
           <w:rStyle w:val="VerbatimChar"/>
         </w:rPr>
-        <w:t xml:space="preserve">/llms.txt</w:t>
-      </w:r>
-      <w:r>
-        <w:t xml:space="preserve"> </w:t>
-      </w:r>
-      <w:r>
-        <w:t xml:space="preserve">file, TalkingToad now validates it against the</w:t>
-      </w:r>
-      <w:r>
-        <w:t xml:space="preserve"> </w:t>
-      </w:r>
-      <w:r>
-        <w:rPr>
-          <w:b/>
-          <w:bCs/>
-        </w:rPr>
-        <w:t xml:space="preserve">llmstxt.org specification</w:t>
-      </w:r>
-      <w:r>
-        <w:t xml:space="preserve"> </w:t>
-      </w:r>
-      <w:r>
-        <w:t xml:space="preserve">rather than stricter invented rules. Only a top-level</w:t>
-      </w:r>
-      <w:r>
-        <w:t xml:space="preserve"> </w:t>
-      </w:r>
-      <w:r>
-        <w:rPr>
-          <w:rStyle w:val="VerbatimChar"/>
-        </w:rPr>
-        <w:t xml:space="preserve"># Title</w:t>
-      </w:r>
-      <w:r>
-        <w:t xml:space="preserve"> </w:t>
-      </w:r>
-      <w:r>
-        <w:t xml:space="preserve">heading is required for the file to be considered valid — a summary, section links, and the number of links are all</w:t>
-      </w:r>
-      <w:r>
-        <w:t xml:space="preserve"> </w:t>
-      </w:r>
-      <w:r>
-        <w:rPr>
-          <w:b/>
-          <w:bCs/>
-        </w:rPr>
-        <w:t xml:space="preserve">optional</w:t>
-      </w:r>
-      <w:r>
-        <w:t xml:space="preserve">, and there is no cap on how many links you may list. A standard plugin-generated file (for example one produced by Yoast) will validate cleanly. A soft-404 or non-Markdown body is still flagged.</w:t>
-      </w:r>
-    </w:p>
-    <w:p>
-      <w:r>
-        <w:pict>
-          <v:rect style="width:0;height:1.5pt" o:hralign="center" o:hrstd="t" o:hr="t"/>
-        </w:pict>
-      </w:r>
-    </w:p>
-    <w:bookmarkEnd w:id="23"/>
-    <w:bookmarkEnd w:id="24"/>
-    <w:bookmarkStart w:id="26" w:name="connecting-external-services"/>
-    <w:p>
-      <w:pPr>
-        <w:pStyle w:val="Heading2"/>
-      </w:pPr>
-      <w:r>
-        <w:t xml:space="preserve">Connecting external services</w:t>
-      </w:r>
-    </w:p>
-    <w:p>
-      <w:pPr>
-        <w:pStyle w:val="FirstParagraph"/>
-      </w:pPr>
-      <w:r>
-        <w:t xml:space="preserve">The</w:t>
-      </w:r>
-      <w:r>
-        <w:t xml:space="preserve"> </w:t>
-      </w:r>
-      <w:r>
-        <w:rPr>
-          <w:b/>
-          <w:bCs/>
-        </w:rPr>
-        <w:t xml:space="preserve">Connections</w:t>
-      </w:r>
-      <w:r>
-        <w:t xml:space="preserve"> </w:t>
-      </w:r>
-      <w:r>
-        <w:t xml:space="preserve">panel (opened from the Results header) lets you check that TalkingToad can reach the two external services it uses, without leaving the results view.</w:t>
+        <w:t xml:space="preserve">noindex</w:t>
+      </w:r>
+      <w:r>
+        <w:t xml:space="preserve"> </w:t>
+      </w:r>
+      <w:r>
+        <w:t xml:space="preserve">on a page you want indexed, or redirect loops) remain</w:t>
+      </w:r>
+      <w:r>
+        <w:t xml:space="preserve"> </w:t>
+      </w:r>
+      <w:r>
+        <w:rPr>
+          <w:b/>
+          <w:bCs/>
+        </w:rPr>
+        <w:t xml:space="preserve">Critical</w:t>
+      </w:r>
+      <w:r>
+        <w:t xml:space="preserve">.</w:t>
+      </w:r>
+      <w:r>
+        <w:t xml:space="preserve"> </w:t>
+      </w:r>
+      <w:r>
+        <w:rPr>
+          <w:b/>
+          <w:bCs/>
+        </w:rPr>
+        <w:t xml:space="preserve">Broken links</w:t>
+      </w:r>
+      <w:r>
+        <w:t xml:space="preserve"> </w:t>
+      </w:r>
+      <w:r>
+        <w:t xml:space="preserve">are now scored as</w:t>
+      </w:r>
+      <w:r>
+        <w:t xml:space="preserve"> </w:t>
+      </w:r>
+      <w:r>
+        <w:rPr>
+          <w:b/>
+          <w:bCs/>
+        </w:rPr>
+        <w:t xml:space="preserve">minor</w:t>
+      </w:r>
+      <w:r>
+        <w:t xml:space="preserve"> </w:t>
+      </w:r>
+      <w:r>
+        <w:t xml:space="preserve">(low impact) rather than critical: they’re worth fixing, but they rarely sink your search visibility on their own.</w:t>
       </w:r>
     </w:p>
     <w:p>
@@ -1974,17 +1847,23 @@
         </w:numPr>
       </w:pPr>
       <w:r>
-        <w:rPr>
-          <w:b/>
-          <w:bCs/>
-        </w:rPr>
-        <w:t xml:space="preserve">Test LLM connection</w:t>
-      </w:r>
-      <w:r>
-        <w:t xml:space="preserve"> </w:t>
-      </w:r>
-      <w:r>
-        <w:t xml:space="preserve">— runs a real round-trip against your configured AI provider (Gemini/OpenAI) and reports success or the exact error. Use this if AI-powered suggestions aren’t appearing.</w:t>
+        <w:t xml:space="preserve">🔴</w:t>
+      </w:r>
+      <w:r>
+        <w:t xml:space="preserve"> </w:t>
+      </w:r>
+      <w:r>
+        <w:rPr>
+          <w:b/>
+          <w:bCs/>
+        </w:rPr>
+        <w:t xml:space="preserve">Critical</w:t>
+      </w:r>
+      <w:r>
+        <w:t xml:space="preserve"> </w:t>
+      </w:r>
+      <w:r>
+        <w:t xml:space="preserve">— Fix these first; they directly harm your search visibility (reserved for page-fatal problems)</w:t>
       </w:r>
     </w:p>
     <w:p>
@@ -1996,26 +1875,61 @@
         </w:numPr>
       </w:pPr>
       <w:r>
-        <w:rPr>
-          <w:b/>
-          <w:bCs/>
-        </w:rPr>
-        <w:t xml:space="preserve">Test GSC connection</w:t>
-      </w:r>
-      <w:r>
-        <w:t xml:space="preserve"> </w:t>
-      </w:r>
-      <w:r>
-        <w:t xml:space="preserve">— checks whether Google Search Console is connected and lists the properties TalkingToad can see.</w:t>
-      </w:r>
-    </w:p>
-    <w:bookmarkStart w:id="25" w:name="connecting-google-search-console"/>
+        <w:t xml:space="preserve">🟡</w:t>
+      </w:r>
+      <w:r>
+        <w:t xml:space="preserve"> </w:t>
+      </w:r>
+      <w:r>
+        <w:rPr>
+          <w:b/>
+          <w:bCs/>
+        </w:rPr>
+        <w:t xml:space="preserve">Warning</w:t>
+      </w:r>
+      <w:r>
+        <w:t xml:space="preserve"> </w:t>
+      </w:r>
+      <w:r>
+        <w:t xml:space="preserve">— Should be fixed; will improve your results</w:t>
+      </w:r>
+    </w:p>
+    <w:p>
+      <w:pPr>
+        <w:pStyle w:val="Compact"/>
+        <w:numPr>
+          <w:ilvl w:val="0"/>
+          <w:numId w:val="1004"/>
+        </w:numPr>
+      </w:pPr>
+      <w:r>
+        <w:t xml:space="preserve">🔵</w:t>
+      </w:r>
+      <w:r>
+        <w:t xml:space="preserve"> </w:t>
+      </w:r>
+      <w:r>
+        <w:rPr>
+          <w:b/>
+          <w:bCs/>
+        </w:rPr>
+        <w:t xml:space="preserve">Info</w:t>
+      </w:r>
+      <w:r>
+        <w:t xml:space="preserve"> </w:t>
+      </w:r>
+      <w:r>
+        <w:t xml:space="preserve">— Worth knowing; low urgency</w:t>
+      </w:r>
+    </w:p>
+    <w:bookmarkEnd w:id="22"/>
+    <w:bookmarkStart w:id="23" w:name="page-priority-queue"/>
     <w:p>
       <w:pPr>
         <w:pStyle w:val="Heading3"/>
       </w:pPr>
       <w:r>
-        <w:t xml:space="preserve">Connecting Google Search Console</w:t>
+        <w:t xml:space="preserve">Page Priority queue</w:t>
       </w:r>
     </w:p>
     <w:p>
@@ -2023,23 +1937,182 @@
         <w:pStyle w:val="FirstParagraph"/>
       </w:pPr>
       <w:r>
-        <w:t xml:space="preserve">Linking Google Search Console lets TalkingToad blend real search-performance data (clicks, impressions) into its authority analysis. The link is</w:t>
-      </w:r>
-      <w:r>
-        <w:t xml:space="preserve"> </w:t>
-      </w:r>
-      <w:r>
-        <w:rPr>
-          <w:b/>
-          <w:bCs/>
-        </w:rPr>
-        <w:t xml:space="preserve">app-wide and one-time</w:t>
-      </w:r>
-      <w:r>
-        <w:t xml:space="preserve"> </w:t>
-      </w:r>
-      <w:r>
-        <w:t xml:space="preserve">— once connected, every crawl can use it.</w:t>
+        <w:t xml:space="preserve">The</w:t>
+      </w:r>
+      <w:r>
+        <w:t xml:space="preserve"> </w:t>
+      </w:r>
+      <w:r>
+        <w:rPr>
+          <w:b/>
+          <w:bCs/>
+        </w:rPr>
+        <w:t xml:space="preserve">Page Priority</w:t>
+      </w:r>
+      <w:r>
+        <w:t xml:space="preserve"> </w:t>
+      </w:r>
+      <w:r>
+        <w:t xml:space="preserve">panel ranks the crawled pages so you know which ones to work on first. When you’re done reviewing the ranked list, click</w:t>
+      </w:r>
+      <w:r>
+        <w:t xml:space="preserve"> </w:t>
+      </w:r>
+      <w:r>
+        <w:rPr>
+          <w:b/>
+          <w:bCs/>
+        </w:rPr>
+        <w:t xml:space="preserve">Hide</w:t>
+      </w:r>
+      <w:r>
+        <w:t xml:space="preserve"> </w:t>
+      </w:r>
+      <w:r>
+        <w:t xml:space="preserve">to collapse it and clear the table; re-opening the panel re-ranks the pages honestly from the current crawl. (The button used to read</w:t>
+      </w:r>
+      <w:r>
+        <w:t xml:space="preserve"> </w:t>
+      </w:r>
+      <w:r>
+        <w:t xml:space="preserve">“Refresh”</w:t>
+      </w:r>
+      <w:r>
+        <w:t xml:space="preserve"> </w:t>
+      </w:r>
+      <w:r>
+        <w:t xml:space="preserve">but only re-displayed the same crawl’s numbers without re-scanning —</w:t>
+      </w:r>
+      <w:r>
+        <w:t xml:space="preserve"> </w:t>
+      </w:r>
+      <w:r>
+        <w:t xml:space="preserve">“Hide”</w:t>
+      </w:r>
+      <w:r>
+        <w:t xml:space="preserve"> </w:t>
+      </w:r>
+      <w:r>
+        <w:t xml:space="preserve">makes what it does clear.)</w:t>
+      </w:r>
+    </w:p>
+    <w:bookmarkEnd w:id="23"/>
+    <w:bookmarkStart w:id="24" w:name="llms.txt-validation"/>
+    <w:p>
+      <w:pPr>
+        <w:pStyle w:val="Heading3"/>
+      </w:pPr>
+      <w:r>
+        <w:t xml:space="preserve">llms.txt validation</w:t>
+      </w:r>
+    </w:p>
+    <w:p>
+      <w:pPr>
+        <w:pStyle w:val="FirstParagraph"/>
+      </w:pPr>
+      <w:r>
+        <w:t xml:space="preserve">If your site publishes an</w:t>
+      </w:r>
+      <w:r>
+        <w:t xml:space="preserve"> </w:t>
+      </w:r>
+      <w:r>
+        <w:rPr>
+          <w:rStyle w:val="VerbatimChar"/>
+        </w:rPr>
+        <w:t xml:space="preserve">/llms.txt</w:t>
+      </w:r>
+      <w:r>
+        <w:t xml:space="preserve"> </w:t>
+      </w:r>
+      <w:r>
+        <w:t xml:space="preserve">file, TalkingToad now validates it against the</w:t>
+      </w:r>
+      <w:r>
+        <w:t xml:space="preserve"> </w:t>
+      </w:r>
+      <w:r>
+        <w:rPr>
+          <w:b/>
+          <w:bCs/>
+        </w:rPr>
+        <w:t xml:space="preserve">llmstxt.org specification</w:t>
+      </w:r>
+      <w:r>
+        <w:t xml:space="preserve"> </w:t>
+      </w:r>
+      <w:r>
+        <w:t xml:space="preserve">rather than stricter invented rules. Only a top-level</w:t>
+      </w:r>
+      <w:r>
+        <w:t xml:space="preserve"> </w:t>
+      </w:r>
+      <w:r>
+        <w:rPr>
+          <w:rStyle w:val="VerbatimChar"/>
+        </w:rPr>
+        <w:t xml:space="preserve"># Title</w:t>
+      </w:r>
+      <w:r>
+        <w:t xml:space="preserve"> </w:t>
+      </w:r>
+      <w:r>
+        <w:t xml:space="preserve">heading is required for the file to be considered valid — a summary, section links, and the number of links are all</w:t>
+      </w:r>
+      <w:r>
+        <w:t xml:space="preserve"> </w:t>
+      </w:r>
+      <w:r>
+        <w:rPr>
+          <w:b/>
+          <w:bCs/>
+        </w:rPr>
+        <w:t xml:space="preserve">optional</w:t>
+      </w:r>
+      <w:r>
+        <w:t xml:space="preserve">, and there is no cap on how many links you may list. A standard plugin-generated file (for example one produced by Yoast) will validate cleanly. A soft-404 or non-Markdown body is still flagged.</w:t>
+      </w:r>
+    </w:p>
+    <w:p>
+      <w:r>
+        <w:pict>
+          <v:rect style="width:0;height:1.5pt" o:hralign="center" o:hrstd="t" o:hr="t"/>
+        </w:pict>
+      </w:r>
+    </w:p>
+    <w:bookmarkEnd w:id="24"/>
+    <w:bookmarkEnd w:id="25"/>
+    <w:bookmarkStart w:id="27" w:name="connecting-external-services"/>
+    <w:p>
+      <w:pPr>
+        <w:pStyle w:val="Heading2"/>
+      </w:pPr>
+      <w:r>
+        <w:t xml:space="preserve">Connecting external services</w:t>
+      </w:r>
+    </w:p>
+    <w:p>
+      <w:pPr>
+        <w:pStyle w:val="FirstParagraph"/>
+      </w:pPr>
+      <w:r>
+        <w:t xml:space="preserve">The</w:t>
+      </w:r>
+      <w:r>
+        <w:t xml:space="preserve"> </w:t>
+      </w:r>
+      <w:r>
+        <w:rPr>
+          <w:b/>
+          <w:bCs/>
+        </w:rPr>
+        <w:t xml:space="preserve">Connections</w:t>
+      </w:r>
+      <w:r>
+        <w:t xml:space="preserve"> </w:t>
+      </w:r>
+      <w:r>
+        <w:t xml:space="preserve">panel (opened from the Results header) lets you check that TalkingToad can reach the two external services it uses, without leaving the results view.</w:t>
       </w:r>
     </w:p>
     <w:p>
@@ -2051,23 +2124,17 @@
         </w:numPr>
       </w:pPr>
       <w:r>
-        <w:t xml:space="preserve">Run a crawl and open the</w:t>
-      </w:r>
-      <w:r>
-        <w:t xml:space="preserve"> </w:t>
-      </w:r>
-      <w:r>
-        <w:rPr>
-          <w:b/>
-          <w:bCs/>
-        </w:rPr>
-        <w:t xml:space="preserve">Results</w:t>
-      </w:r>
-      <w:r>
-        <w:t xml:space="preserve"> </w:t>
-      </w:r>
-      <w:r>
-        <w:t xml:space="preserve">page.</w:t>
+        <w:rPr>
+          <w:b/>
+          <w:bCs/>
+        </w:rPr>
+        <w:t xml:space="preserve">Test LLM connection</w:t>
+      </w:r>
+      <w:r>
+        <w:t xml:space="preserve"> </w:t>
+      </w:r>
+      <w:r>
+        <w:t xml:space="preserve">— runs a real round-trip against your configured AI provider (Gemini/OpenAI) and reports success or the exact error. Use this if AI-powered suggestions aren’t appearing.</w:t>
       </w:r>
     </w:p>
     <w:p>
@@ -2079,48 +2146,26 @@
         </w:numPr>
       </w:pPr>
       <w:r>
-        <w:t xml:space="preserve">Open the</w:t>
-      </w:r>
-      <w:r>
-        <w:t xml:space="preserve"> </w:t>
-      </w:r>
-      <w:r>
-        <w:rPr>
-          <w:b/>
-          <w:bCs/>
-        </w:rPr>
-        <w:t xml:space="preserve">GSC</w:t>
-      </w:r>
-      <w:r>
-        <w:t xml:space="preserve"> </w:t>
-      </w:r>
-      <w:r>
-        <w:t xml:space="preserve">panel (or the Connections panel).</w:t>
-      </w:r>
-    </w:p>
-    <w:p>
-      <w:pPr>
-        <w:pStyle w:val="Compact"/>
-        <w:numPr>
-          <w:ilvl w:val="0"/>
-          <w:numId w:val="1005"/>
-        </w:numPr>
-      </w:pPr>
-      <w:r>
-        <w:t xml:space="preserve">Click</w:t>
-      </w:r>
-      <w:r>
-        <w:t xml:space="preserve"> </w:t>
-      </w:r>
-      <w:r>
-        <w:rPr>
-          <w:b/>
-          <w:bCs/>
-        </w:rPr>
-        <w:t xml:space="preserve">Connect</w:t>
-      </w:r>
-      <w:r>
-        <w:t xml:space="preserve">. Google always shows the account picker, so you choose exactly which Google account TalkingToad connects as.</w:t>
+        <w:rPr>
+          <w:b/>
+          <w:bCs/>
+        </w:rPr>
+        <w:t xml:space="preserve">Test GSC connection</w:t>
+      </w:r>
+      <w:r>
+        <w:t xml:space="preserve"> </w:t>
+      </w:r>
+      <w:r>
+        <w:t xml:space="preserve">— checks whether Google Search Console is connected and lists the properties TalkingToad can see.</w:t>
+      </w:r>
+    </w:p>
+    <w:bookmarkStart w:id="26" w:name="connecting-google-search-console"/>
+    <w:p>
+      <w:pPr>
+        <w:pStyle w:val="Heading3"/>
+      </w:pPr>
+      <w:r>
+        <w:t xml:space="preserve">Connecting Google Search Console</w:t>
       </w:r>
     </w:p>
     <w:p>
@@ -2128,229 +2173,23 @@
         <w:pStyle w:val="FirstParagraph"/>
       </w:pPr>
       <w:r>
-        <w:t xml:space="preserve">TalkingToad connects as</w:t>
-      </w:r>
-      <w:r>
-        <w:t xml:space="preserve"> </w:t>
-      </w:r>
-      <w:r>
-        <w:rPr>
-          <w:b/>
-          <w:bCs/>
-        </w:rPr>
-        <w:t xml:space="preserve">one</w:t>
-      </w:r>
-      <w:r>
-        <w:t xml:space="preserve"> </w:t>
-      </w:r>
-      <w:r>
-        <w:t xml:space="preserve">Google account — the panel shows</w:t>
-      </w:r>
-      <w:r>
-        <w:t xml:space="preserve"> </w:t>
-      </w:r>
-      <w:r>
-        <w:rPr>
-          <w:b/>
-          <w:bCs/>
-        </w:rPr>
-        <w:t xml:space="preserve">“Connected as {your email}”</w:t>
-      </w:r>
-      <w:r>
-        <w:t xml:space="preserve"> </w:t>
-      </w:r>
-      <w:r>
-        <w:t xml:space="preserve">so you always know which account is in use. (Accounts linked before this feature show</w:t>
-      </w:r>
-      <w:r>
-        <w:t xml:space="preserve"> </w:t>
-      </w:r>
-      <w:r>
-        <w:t xml:space="preserve">“account not identified”</w:t>
-      </w:r>
-      <w:r>
-        <w:t xml:space="preserve"> </w:t>
-      </w:r>
-      <w:r>
-        <w:t xml:space="preserve">until you reconnect once.)</w:t>
-      </w:r>
-    </w:p>
-    <w:p>
-      <w:pPr>
-        <w:pStyle w:val="BodyText"/>
-      </w:pPr>
-      <w:r>
-        <w:t xml:space="preserve">Each property in the dropdown is labelled with your access level —</w:t>
-      </w:r>
-      <w:r>
-        <w:t xml:space="preserve"> </w:t>
-      </w:r>
-      <w:r>
-        <w:rPr>
-          <w:b/>
-          <w:bCs/>
-        </w:rPr>
-        <w:t xml:space="preserve">Owner</w:t>
-      </w:r>
-      <w:r>
-        <w:t xml:space="preserve">,</w:t>
-      </w:r>
-      <w:r>
-        <w:t xml:space="preserve"> </w:t>
-      </w:r>
-      <w:r>
-        <w:rPr>
-          <w:b/>
-          <w:bCs/>
-        </w:rPr>
-        <w:t xml:space="preserve">Full</w:t>
-      </w:r>
-      <w:r>
-        <w:t xml:space="preserve">,</w:t>
-      </w:r>
-      <w:r>
-        <w:t xml:space="preserve"> </w:t>
-      </w:r>
-      <w:r>
-        <w:rPr>
-          <w:b/>
-          <w:bCs/>
-        </w:rPr>
-        <w:t xml:space="preserve">Restricted</w:t>
-      </w:r>
-      <w:r>
-        <w:t xml:space="preserve">, or</w:t>
-      </w:r>
-      <w:r>
-        <w:t xml:space="preserve"> </w:t>
-      </w:r>
-      <w:r>
-        <w:rPr>
-          <w:b/>
-          <w:bCs/>
-        </w:rPr>
-        <w:t xml:space="preserve">Unverified</w:t>
-      </w:r>
-      <w:r>
-        <w:t xml:space="preserve">. TalkingToad auto-selects the property you have the strongest access to.</w:t>
-      </w:r>
-      <w:r>
-        <w:t xml:space="preserve"> </w:t>
-      </w:r>
-      <w:r>
-        <w:rPr>
-          <w:b/>
-          <w:bCs/>
-        </w:rPr>
-        <w:t xml:space="preserve">The account you connect as must be an Owner or Full user of the property you pick</w:t>
-      </w:r>
-      <w:r>
-        <w:t xml:space="preserve"> </w:t>
-      </w:r>
-      <w:r>
-        <w:t xml:space="preserve">— if you select a Restricted or Unverified property, ingest may be denied and the panel warns you. Either pick an Owner/Full property or grant this account access in Search Console.</w:t>
-      </w:r>
-    </w:p>
-    <w:p>
-      <w:pPr>
-        <w:pStyle w:val="BodyText"/>
-      </w:pPr>
-      <w:r>
-        <w:t xml:space="preserve">If TalkingToad is configured for GSC but not yet linked, the panel shows a</w:t>
-      </w:r>
-      <w:r>
-        <w:t xml:space="preserve"> </w:t>
-      </w:r>
-      <w:r>
-        <w:rPr>
-          <w:b/>
-          <w:bCs/>
-        </w:rPr>
-        <w:t xml:space="preserve">Connect</w:t>
-      </w:r>
-      <w:r>
-        <w:t xml:space="preserve"> </w:t>
-      </w:r>
-      <w:r>
-        <w:t xml:space="preserve">button with step-by-step guidance. If GSC hasn’t been configured on this install at all, the panel stays quietly empty (there is nothing to connect to yet).</w:t>
-      </w:r>
-    </w:p>
-    <w:p>
-      <w:r>
-        <w:pict>
-          <v:rect style="width:0;height:1.5pt" o:hralign="center" o:hrstd="t" o:hr="t"/>
-        </w:pict>
-      </w:r>
-    </w:p>
-    <w:bookmarkEnd w:id="25"/>
-    <w:bookmarkEnd w:id="26"/>
-    <w:bookmarkStart w:id="32" w:name="fix-manager-wordpress-sites"/>
-    <w:p>
-      <w:pPr>
-        <w:pStyle w:val="Heading2"/>
-      </w:pPr>
-      <w:r>
-        <w:t xml:space="preserve">Fix Manager (WordPress Sites)</w:t>
-      </w:r>
-    </w:p>
-    <w:p>
-      <w:pPr>
-        <w:pStyle w:val="FirstParagraph"/>
-      </w:pPr>
-      <w:r>
-        <w:t xml:space="preserve">The</w:t>
-      </w:r>
-      <w:r>
-        <w:t xml:space="preserve"> </w:t>
-      </w:r>
-      <w:r>
-        <w:rPr>
-          <w:b/>
-          <w:bCs/>
-        </w:rPr>
-        <w:t xml:space="preserve">Fix Manager</w:t>
-      </w:r>
-      <w:r>
-        <w:t xml:space="preserve"> </w:t>
-      </w:r>
-      <w:r>
-        <w:t xml:space="preserve">tab lets you connect TalkingToad to your WordPress site and apply fixes directly — no coding required.</w:t>
-      </w:r>
-    </w:p>
-    <w:bookmarkStart w:id="27" w:name="setup"/>
-    <w:p>
-      <w:pPr>
-        <w:pStyle w:val="Heading3"/>
-      </w:pPr>
-      <w:r>
-        <w:t xml:space="preserve">Setup</w:t>
-      </w:r>
-    </w:p>
-    <w:p>
-      <w:pPr>
-        <w:pStyle w:val="FirstParagraph"/>
-      </w:pPr>
-      <w:r>
-        <w:t xml:space="preserve">You will need a credentials file (</w:t>
-      </w:r>
-      <w:r>
-        <w:rPr>
-          <w:rStyle w:val="VerbatimChar"/>
-        </w:rPr>
-        <w:t xml:space="preserve">wp-credentials.json</w:t>
-      </w:r>
-      <w:r>
-        <w:t xml:space="preserve">) with your WordPress login details. Ask your developer to help you create this the first time.</w:t>
-      </w:r>
-    </w:p>
-    <w:bookmarkEnd w:id="27"/>
-    <w:bookmarkStart w:id="28" w:name="how-it-works"/>
-    <w:p>
-      <w:pPr>
-        <w:pStyle w:val="Heading3"/>
-      </w:pPr>
-      <w:r>
-        <w:t xml:space="preserve">How it works</w:t>
+        <w:t xml:space="preserve">Linking Google Search Console lets TalkingToad blend real search-performance data (clicks, impressions) into its authority analysis. The link is</w:t>
+      </w:r>
+      <w:r>
+        <w:t xml:space="preserve"> </w:t>
+      </w:r>
+      <w:r>
+        <w:rPr>
+          <w:b/>
+          <w:bCs/>
+        </w:rPr>
+        <w:t xml:space="preserve">app-wide and one-time</w:t>
+      </w:r>
+      <w:r>
+        <w:t xml:space="preserve"> </w:t>
+      </w:r>
+      <w:r>
+        <w:t xml:space="preserve">— once connected, every crawl can use it.</w:t>
       </w:r>
     </w:p>
     <w:p>
@@ -2362,23 +2201,23 @@
         </w:numPr>
       </w:pPr>
       <w:r>
-        <w:t xml:space="preserve">Click</w:t>
-      </w:r>
-      <w:r>
-        <w:t xml:space="preserve"> </w:t>
-      </w:r>
-      <w:r>
-        <w:rPr>
-          <w:b/>
-          <w:bCs/>
-        </w:rPr>
-        <w:t xml:space="preserve">Scan for Fixes</w:t>
-      </w:r>
-      <w:r>
-        <w:t xml:space="preserve"> </w:t>
-      </w:r>
-      <w:r>
-        <w:t xml:space="preserve">— TalkingToad connects to your WordPress site and generates a list of issues that can be fixed automatically (missing titles, meta descriptions, noindex pages, etc.)</w:t>
+        <w:t xml:space="preserve">Run a crawl and open the</w:t>
+      </w:r>
+      <w:r>
+        <w:t xml:space="preserve"> </w:t>
+      </w:r>
+      <w:r>
+        <w:rPr>
+          <w:b/>
+          <w:bCs/>
+        </w:rPr>
+        <w:t xml:space="preserve">Results</w:t>
+      </w:r>
+      <w:r>
+        <w:t xml:space="preserve"> </w:t>
+      </w:r>
+      <w:r>
+        <w:t xml:space="preserve">page.</w:t>
       </w:r>
     </w:p>
     <w:p>
@@ -2390,17 +2229,23 @@
         </w:numPr>
       </w:pPr>
       <w:r>
-        <w:rPr>
-          <w:b/>
-          <w:bCs/>
-        </w:rPr>
-        <w:t xml:space="preserve">Review each fix</w:t>
-      </w:r>
-      <w:r>
-        <w:t xml:space="preserve"> </w:t>
-      </w:r>
-      <w:r>
-        <w:t xml:space="preserve">— TalkingToad shows the current value and a suggested replacement. You can edit the suggestion before approving.</w:t>
+        <w:t xml:space="preserve">Open the</w:t>
+      </w:r>
+      <w:r>
+        <w:t xml:space="preserve"> </w:t>
+      </w:r>
+      <w:r>
+        <w:rPr>
+          <w:b/>
+          <w:bCs/>
+        </w:rPr>
+        <w:t xml:space="preserve">GSC</w:t>
+      </w:r>
+      <w:r>
+        <w:t xml:space="preserve"> </w:t>
+      </w:r>
+      <w:r>
+        <w:t xml:space="preserve">panel (or the Connections panel).</w:t>
       </w:r>
     </w:p>
     <w:p>
@@ -2422,57 +2267,10 @@
           <w:b/>
           <w:bCs/>
         </w:rPr>
-        <w:t xml:space="preserve">Approve</w:t>
-      </w:r>
-      <w:r>
-        <w:t xml:space="preserve"> </w:t>
-      </w:r>
-      <w:r>
-        <w:t xml:space="preserve">on each fix you are happy with (or</w:t>
-      </w:r>
-      <w:r>
-        <w:t xml:space="preserve"> </w:t>
-      </w:r>
-      <w:r>
-        <w:rPr>
-          <w:b/>
-          <w:bCs/>
-        </w:rPr>
-        <w:t xml:space="preserve">Skip</w:t>
-      </w:r>
-      <w:r>
-        <w:t xml:space="preserve"> </w:t>
-      </w:r>
-      <w:r>
-        <w:t xml:space="preserve">to leave it unchanged)</w:t>
-      </w:r>
-    </w:p>
-    <w:p>
-      <w:pPr>
-        <w:pStyle w:val="Compact"/>
-        <w:numPr>
-          <w:ilvl w:val="0"/>
-          <w:numId w:val="1006"/>
-        </w:numPr>
-      </w:pPr>
-      <w:r>
-        <w:t xml:space="preserve">Click</w:t>
-      </w:r>
-      <w:r>
-        <w:t xml:space="preserve"> </w:t>
-      </w:r>
-      <w:r>
-        <w:rPr>
-          <w:b/>
-          <w:bCs/>
-        </w:rPr>
-        <w:t xml:space="preserve">Apply Approved Fixes</w:t>
-      </w:r>
-      <w:r>
-        <w:t xml:space="preserve"> </w:t>
-      </w:r>
-      <w:r>
-        <w:t xml:space="preserve">— TalkingToad writes the changes to WordPress</w:t>
+        <w:t xml:space="preserve">Connect</w:t>
+      </w:r>
+      <w:r>
+        <w:t xml:space="preserve">. Google always shows the account picker, so you choose exactly which Google account TalkingToad connects as.</w:t>
       </w:r>
     </w:p>
     <w:p>
@@ -2480,17 +2278,229 @@
         <w:pStyle w:val="FirstParagraph"/>
       </w:pPr>
       <w:r>
-        <w:t xml:space="preserve">Fixes are applied one at a time. If something goes wrong, the process stops so you can review the error before continuing.</w:t>
+        <w:t xml:space="preserve">TalkingToad connects as</w:t>
+      </w:r>
+      <w:r>
+        <w:t xml:space="preserve"> </w:t>
+      </w:r>
+      <w:r>
+        <w:rPr>
+          <w:b/>
+          <w:bCs/>
+        </w:rPr>
+        <w:t xml:space="preserve">one</w:t>
+      </w:r>
+      <w:r>
+        <w:t xml:space="preserve"> </w:t>
+      </w:r>
+      <w:r>
+        <w:t xml:space="preserve">Google account — the panel shows</w:t>
+      </w:r>
+      <w:r>
+        <w:t xml:space="preserve"> </w:t>
+      </w:r>
+      <w:r>
+        <w:rPr>
+          <w:b/>
+          <w:bCs/>
+        </w:rPr>
+        <w:t xml:space="preserve">“Connected as {your email}”</w:t>
+      </w:r>
+      <w:r>
+        <w:t xml:space="preserve"> </w:t>
+      </w:r>
+      <w:r>
+        <w:t xml:space="preserve">so you always know which account is in use. (Accounts linked before this feature show</w:t>
+      </w:r>
+      <w:r>
+        <w:t xml:space="preserve"> </w:t>
+      </w:r>
+      <w:r>
+        <w:t xml:space="preserve">“account not identified”</w:t>
+      </w:r>
+      <w:r>
+        <w:t xml:space="preserve"> </w:t>
+      </w:r>
+      <w:r>
+        <w:t xml:space="preserve">until you reconnect once.)</w:t>
+      </w:r>
+    </w:p>
+    <w:p>
+      <w:pPr>
+        <w:pStyle w:val="BodyText"/>
+      </w:pPr>
+      <w:r>
+        <w:t xml:space="preserve">Each property in the dropdown is labelled with your access level —</w:t>
+      </w:r>
+      <w:r>
+        <w:t xml:space="preserve"> </w:t>
+      </w:r>
+      <w:r>
+        <w:rPr>
+          <w:b/>
+          <w:bCs/>
+        </w:rPr>
+        <w:t xml:space="preserve">Owner</w:t>
+      </w:r>
+      <w:r>
+        <w:t xml:space="preserve">,</w:t>
+      </w:r>
+      <w:r>
+        <w:t xml:space="preserve"> </w:t>
+      </w:r>
+      <w:r>
+        <w:rPr>
+          <w:b/>
+          <w:bCs/>
+        </w:rPr>
+        <w:t xml:space="preserve">Full</w:t>
+      </w:r>
+      <w:r>
+        <w:t xml:space="preserve">,</w:t>
+      </w:r>
+      <w:r>
+        <w:t xml:space="preserve"> </w:t>
+      </w:r>
+      <w:r>
+        <w:rPr>
+          <w:b/>
+          <w:bCs/>
+        </w:rPr>
+        <w:t xml:space="preserve">Restricted</w:t>
+      </w:r>
+      <w:r>
+        <w:t xml:space="preserve">, or</w:t>
+      </w:r>
+      <w:r>
+        <w:t xml:space="preserve"> </w:t>
+      </w:r>
+      <w:r>
+        <w:rPr>
+          <w:b/>
+          <w:bCs/>
+        </w:rPr>
+        <w:t xml:space="preserve">Unverified</w:t>
+      </w:r>
+      <w:r>
+        <w:t xml:space="preserve">. TalkingToad auto-selects the property you have the strongest access to.</w:t>
+      </w:r>
+      <w:r>
+        <w:t xml:space="preserve"> </w:t>
+      </w:r>
+      <w:r>
+        <w:rPr>
+          <w:b/>
+          <w:bCs/>
+        </w:rPr>
+        <w:t xml:space="preserve">The account you connect as must be an Owner or Full user of the property you pick</w:t>
+      </w:r>
+      <w:r>
+        <w:t xml:space="preserve"> </w:t>
+      </w:r>
+      <w:r>
+        <w:t xml:space="preserve">— if you select a Restricted or Unverified property, ingest may be denied and the panel warns you. Either pick an Owner/Full property or grant this account access in Search Console.</w:t>
+      </w:r>
+    </w:p>
+    <w:p>
+      <w:pPr>
+        <w:pStyle w:val="BodyText"/>
+      </w:pPr>
+      <w:r>
+        <w:t xml:space="preserve">If TalkingToad is configured for GSC but not yet linked, the panel shows a</w:t>
+      </w:r>
+      <w:r>
+        <w:t xml:space="preserve"> </w:t>
+      </w:r>
+      <w:r>
+        <w:rPr>
+          <w:b/>
+          <w:bCs/>
+        </w:rPr>
+        <w:t xml:space="preserve">Connect</w:t>
+      </w:r>
+      <w:r>
+        <w:t xml:space="preserve"> </w:t>
+      </w:r>
+      <w:r>
+        <w:t xml:space="preserve">button with step-by-step guidance. If GSC hasn’t been configured on this install at all, the panel stays quietly empty (there is nothing to connect to yet).</w:t>
+      </w:r>
+    </w:p>
+    <w:p>
+      <w:r>
+        <w:pict>
+          <v:rect style="width:0;height:1.5pt" o:hralign="center" o:hrstd="t" o:hr="t"/>
+        </w:pict>
+      </w:r>
+    </w:p>
+    <w:bookmarkEnd w:id="26"/>
+    <w:bookmarkEnd w:id="27"/>
+    <w:bookmarkStart w:id="33" w:name="fix-manager-wordpress-sites"/>
+    <w:p>
+      <w:pPr>
+        <w:pStyle w:val="Heading2"/>
+      </w:pPr>
+      <w:r>
+        <w:t xml:space="preserve">Fix Manager (WordPress Sites)</w:t>
+      </w:r>
+    </w:p>
+    <w:p>
+      <w:pPr>
+        <w:pStyle w:val="FirstParagraph"/>
+      </w:pPr>
+      <w:r>
+        <w:t xml:space="preserve">The</w:t>
+      </w:r>
+      <w:r>
+        <w:t xml:space="preserve"> </w:t>
+      </w:r>
+      <w:r>
+        <w:rPr>
+          <w:b/>
+          <w:bCs/>
+        </w:rPr>
+        <w:t xml:space="preserve">Fix Manager</w:t>
+      </w:r>
+      <w:r>
+        <w:t xml:space="preserve"> </w:t>
+      </w:r>
+      <w:r>
+        <w:t xml:space="preserve">tab lets you connect TalkingToad to your WordPress site and apply fixes directly — no coding required.</w:t>
+      </w:r>
+    </w:p>
+    <w:bookmarkStart w:id="28" w:name="setup"/>
+    <w:p>
+      <w:pPr>
+        <w:pStyle w:val="Heading3"/>
+      </w:pPr>
+      <w:r>
+        <w:t xml:space="preserve">Setup</w:t>
+      </w:r>
+    </w:p>
+    <w:p>
+      <w:pPr>
+        <w:pStyle w:val="FirstParagraph"/>
+      </w:pPr>
+      <w:r>
+        <w:t xml:space="preserve">You will need a credentials file (</w:t>
+      </w:r>
+      <w:r>
+        <w:rPr>
+          <w:rStyle w:val="VerbatimChar"/>
+        </w:rPr>
+        <w:t xml:space="preserve">wp-credentials.json</w:t>
+      </w:r>
+      <w:r>
+        <w:t xml:space="preserve">) with your WordPress login details. Ask your developer to help you create this the first time.</w:t>
       </w:r>
     </w:p>
     <w:bookmarkEnd w:id="28"/>
-    <w:bookmarkStart w:id="29" w:name="what-can-be-fixed-automatically"/>
+    <w:bookmarkStart w:id="29" w:name="how-it-works"/>
     <w:p>
       <w:pPr>
         <w:pStyle w:val="Heading3"/>
       </w:pPr>
       <w:r>
-        <w:t xml:space="preserve">What can be fixed automatically</w:t>
+        <w:t xml:space="preserve">How it works</w:t>
       </w:r>
     </w:p>
     <w:p>
@@ -2502,7 +2512,23 @@
         </w:numPr>
       </w:pPr>
       <w:r>
-        <w:t xml:space="preserve">Missing or poor page titles (SEO title)</w:t>
+        <w:t xml:space="preserve">Click</w:t>
+      </w:r>
+      <w:r>
+        <w:t xml:space="preserve"> </w:t>
+      </w:r>
+      <w:r>
+        <w:rPr>
+          <w:b/>
+          <w:bCs/>
+        </w:rPr>
+        <w:t xml:space="preserve">Scan for Fixes</w:t>
+      </w:r>
+      <w:r>
+        <w:t xml:space="preserve"> </w:t>
+      </w:r>
+      <w:r>
+        <w:t xml:space="preserve">— TalkingToad connects to your WordPress site and generates a list of issues that can be fixed automatically (missing titles, meta descriptions, noindex pages, etc.)</w:t>
       </w:r>
     </w:p>
     <w:p>
@@ -2514,7 +2540,17 @@
         </w:numPr>
       </w:pPr>
       <w:r>
-        <w:t xml:space="preserve">Missing or poor meta descriptions</w:t>
+        <w:rPr>
+          <w:b/>
+          <w:bCs/>
+        </w:rPr>
+        <w:t xml:space="preserve">Review each fix</w:t>
+      </w:r>
+      <w:r>
+        <w:t xml:space="preserve"> </w:t>
+      </w:r>
+      <w:r>
+        <w:t xml:space="preserve">— TalkingToad shows the current value and a suggested replacement. You can edit the suggestion before approving.</w:t>
       </w:r>
     </w:p>
     <w:p>
@@ -2526,7 +2562,39 @@
         </w:numPr>
       </w:pPr>
       <w:r>
-        <w:t xml:space="preserve">Missing OG (social share) titles and descriptions</w:t>
+        <w:t xml:space="preserve">Click</w:t>
+      </w:r>
+      <w:r>
+        <w:t xml:space="preserve"> </w:t>
+      </w:r>
+      <w:r>
+        <w:rPr>
+          <w:b/>
+          <w:bCs/>
+        </w:rPr>
+        <w:t xml:space="preserve">Approve</w:t>
+      </w:r>
+      <w:r>
+        <w:t xml:space="preserve"> </w:t>
+      </w:r>
+      <w:r>
+        <w:t xml:space="preserve">on each fix you are happy with (or</w:t>
+      </w:r>
+      <w:r>
+        <w:t xml:space="preserve"> </w:t>
+      </w:r>
+      <w:r>
+        <w:rPr>
+          <w:b/>
+          <w:bCs/>
+        </w:rPr>
+        <w:t xml:space="preserve">Skip</w:t>
+      </w:r>
+      <w:r>
+        <w:t xml:space="preserve"> </w:t>
+      </w:r>
+      <w:r>
+        <w:t xml:space="preserve">to leave it unchanged)</w:t>
       </w:r>
     </w:p>
     <w:p>
@@ -2538,49 +2606,41 @@
         </w:numPr>
       </w:pPr>
       <w:r>
-        <w:t xml:space="preserve">Pages incorrectly set to noindex (hidden from search)</w:t>
-      </w:r>
-    </w:p>
-    <w:p>
-      <w:pPr>
-        <w:pStyle w:val="Compact"/>
-        <w:numPr>
-          <w:ilvl w:val="0"/>
-          <w:numId w:val="1007"/>
-        </w:numPr>
-      </w:pPr>
-      <w:r>
-        <w:t xml:space="preserve">Heading level changes (H1 to H2, H3 to H4, etc.)</w:t>
-      </w:r>
-    </w:p>
-    <w:p>
-      <w:pPr>
-        <w:pStyle w:val="Compact"/>
-        <w:numPr>
-          <w:ilvl w:val="0"/>
-          <w:numId w:val="1007"/>
-        </w:numPr>
-      </w:pPr>
-      <w:r>
-        <w:t xml:space="preserve">Convert headings to bold text (remove heading status)</w:t>
+        <w:t xml:space="preserve">Click</w:t>
+      </w:r>
+      <w:r>
+        <w:t xml:space="preserve"> </w:t>
+      </w:r>
+      <w:r>
+        <w:rPr>
+          <w:b/>
+          <w:bCs/>
+        </w:rPr>
+        <w:t xml:space="preserve">Apply Approved Fixes</w:t>
+      </w:r>
+      <w:r>
+        <w:t xml:space="preserve"> </w:t>
+      </w:r>
+      <w:r>
+        <w:t xml:space="preserve">— TalkingToad writes the changes to WordPress</w:t>
+      </w:r>
+    </w:p>
+    <w:p>
+      <w:pPr>
+        <w:pStyle w:val="FirstParagraph"/>
+      </w:pPr>
+      <w:r>
+        <w:t xml:space="preserve">Fixes are applied one at a time. If something goes wrong, the process stops so you can review the error before continuing.</w:t>
       </w:r>
     </w:p>
     <w:bookmarkEnd w:id="29"/>
-    <w:bookmarkStart w:id="30" w:name="editing-headings"/>
+    <w:bookmarkStart w:id="30" w:name="what-can-be-fixed-automatically"/>
     <w:p>
       <w:pPr>
         <w:pStyle w:val="Heading3"/>
       </w:pPr>
       <w:r>
-        <w:t xml:space="preserve">Editing Headings</w:t>
-      </w:r>
-    </w:p>
-    <w:p>
-      <w:pPr>
-        <w:pStyle w:val="FirstParagraph"/>
-      </w:pPr>
-      <w:r>
-        <w:t xml:space="preserve">When viewing a page’s details, you can edit headings directly:</w:t>
+        <w:t xml:space="preserve">What can be fixed automatically</w:t>
       </w:r>
     </w:p>
     <w:p>
@@ -2592,17 +2652,7 @@
         </w:numPr>
       </w:pPr>
       <w:r>
-        <w:rPr>
-          <w:b/>
-          <w:bCs/>
-        </w:rPr>
-        <w:t xml:space="preserve">Open the page panel</w:t>
-      </w:r>
-      <w:r>
-        <w:t xml:space="preserve"> </w:t>
-      </w:r>
-      <w:r>
-        <w:t xml:space="preserve">— Click on any page in the results</w:t>
+        <w:t xml:space="preserve">Missing or poor page titles (SEO title)</w:t>
       </w:r>
     </w:p>
     <w:p>
@@ -2614,17 +2664,7 @@
         </w:numPr>
       </w:pPr>
       <w:r>
-        <w:rPr>
-          <w:b/>
-          <w:bCs/>
-        </w:rPr>
-        <w:t xml:space="preserve">Find the heading editor</w:t>
-      </w:r>
-      <w:r>
-        <w:t xml:space="preserve"> </w:t>
-      </w:r>
-      <w:r>
-        <w:t xml:space="preserve">— Below the page details, you’ll see the heading outline</w:t>
+        <w:t xml:space="preserve">Missing or poor meta descriptions</w:t>
       </w:r>
     </w:p>
     <w:p>
@@ -2636,6 +2676,116 @@
         </w:numPr>
       </w:pPr>
       <w:r>
+        <w:t xml:space="preserve">Missing OG (social share) titles and descriptions</w:t>
+      </w:r>
+    </w:p>
+    <w:p>
+      <w:pPr>
+        <w:pStyle w:val="Compact"/>
+        <w:numPr>
+          <w:ilvl w:val="0"/>
+          <w:numId w:val="1008"/>
+        </w:numPr>
+      </w:pPr>
+      <w:r>
+        <w:t xml:space="preserve">Pages incorrectly set to noindex (hidden from search)</w:t>
+      </w:r>
+    </w:p>
+    <w:p>
+      <w:pPr>
+        <w:pStyle w:val="Compact"/>
+        <w:numPr>
+          <w:ilvl w:val="0"/>
+          <w:numId w:val="1008"/>
+        </w:numPr>
+      </w:pPr>
+      <w:r>
+        <w:t xml:space="preserve">Heading level changes (H1 to H2, H3 to H4, etc.)</w:t>
+      </w:r>
+    </w:p>
+    <w:p>
+      <w:pPr>
+        <w:pStyle w:val="Compact"/>
+        <w:numPr>
+          <w:ilvl w:val="0"/>
+          <w:numId w:val="1008"/>
+        </w:numPr>
+      </w:pPr>
+      <w:r>
+        <w:t xml:space="preserve">Convert headings to bold text (remove heading status)</w:t>
+      </w:r>
+    </w:p>
+    <w:bookmarkEnd w:id="30"/>
+    <w:bookmarkStart w:id="31" w:name="editing-headings"/>
+    <w:p>
+      <w:pPr>
+        <w:pStyle w:val="Heading3"/>
+      </w:pPr>
+      <w:r>
+        <w:t xml:space="preserve">Editing Headings</w:t>
+      </w:r>
+    </w:p>
+    <w:p>
+      <w:pPr>
+        <w:pStyle w:val="FirstParagraph"/>
+      </w:pPr>
+      <w:r>
+        <w:t xml:space="preserve">When viewing a page’s details, you can edit headings directly:</w:t>
+      </w:r>
+    </w:p>
+    <w:p>
+      <w:pPr>
+        <w:pStyle w:val="Compact"/>
+        <w:numPr>
+          <w:ilvl w:val="0"/>
+          <w:numId w:val="1009"/>
+        </w:numPr>
+      </w:pPr>
+      <w:r>
+        <w:rPr>
+          <w:b/>
+          <w:bCs/>
+        </w:rPr>
+        <w:t xml:space="preserve">Open the page panel</w:t>
+      </w:r>
+      <w:r>
+        <w:t xml:space="preserve"> </w:t>
+      </w:r>
+      <w:r>
+        <w:t xml:space="preserve">— Click on any page in the results</w:t>
+      </w:r>
+    </w:p>
+    <w:p>
+      <w:pPr>
+        <w:pStyle w:val="Compact"/>
+        <w:numPr>
+          <w:ilvl w:val="0"/>
+          <w:numId w:val="1009"/>
+        </w:numPr>
+      </w:pPr>
+      <w:r>
+        <w:rPr>
+          <w:b/>
+          <w:bCs/>
+        </w:rPr>
+        <w:t xml:space="preserve">Find the heading editor</w:t>
+      </w:r>
+      <w:r>
+        <w:t xml:space="preserve"> </w:t>
+      </w:r>
+      <w:r>
+        <w:t xml:space="preserve">— Below the page details, you’ll see the heading outline</w:t>
+      </w:r>
+    </w:p>
+    <w:p>
+      <w:pPr>
+        <w:pStyle w:val="Compact"/>
+        <w:numPr>
+          <w:ilvl w:val="0"/>
+          <w:numId w:val="1009"/>
+        </w:numPr>
+      </w:pPr>
+      <w:r>
         <w:rPr>
           <w:b/>
           <w:bCs/>
@@ -2785,8 +2935,8 @@
         <w:t xml:space="preserve">Headings marked as Theme/Plugin cannot be changed via the API — they’re generated dynamically by your WordPress theme or a plugin (like custom heading blocks, shortcodes, or page builders).</w:t>
       </w:r>
     </w:p>
-    <w:bookmarkEnd w:id="30"/>
-    <w:bookmarkStart w:id="31" w:name="supported-seo-plugins"/>
+    <w:bookmarkEnd w:id="31"/>
+    <w:bookmarkStart w:id="32" w:name="supported-seo-plugins"/>
     <w:p>
       <w:pPr>
         <w:pStyle w:val="Heading3"/>
@@ -2842,9 +2992,9 @@
         </w:pict>
       </w:r>
     </w:p>
-    <w:bookmarkEnd w:id="31"/>
     <w:bookmarkEnd w:id="32"/>
-    <w:bookmarkStart w:id="33" w:name="faq-schema-generator"/>
+    <w:bookmarkEnd w:id="33"/>
+    <w:bookmarkStart w:id="34" w:name="faq-schema-generator"/>
     <w:p>
       <w:pPr>
         <w:pStyle w:val="Heading2"/>
@@ -2908,8 +3058,8 @@
         </w:pict>
       </w:r>
     </w:p>
-    <w:bookmarkEnd w:id="33"/>
-    <w:bookmarkStart w:id="35" w:name="exporting-results"/>
+    <w:bookmarkEnd w:id="34"/>
+    <w:bookmarkStart w:id="36" w:name="exporting-results"/>
     <w:p>
       <w:pPr>
         <w:pStyle w:val="Heading2"/>
@@ -2942,7 +3092,7 @@
         <w:t xml:space="preserve">on any results tab to download the data as a spreadsheet. You can share this with your web developer or use it to track progress over time.</w:t>
       </w:r>
     </w:p>
-    <w:bookmarkStart w:id="34" w:name="scoring-model-version"/>
+    <w:bookmarkStart w:id="35" w:name="scoring-model-version"/>
     <w:p>
       <w:pPr>
         <w:pStyle w:val="Heading3"/>
@@ -2994,9 +3144,9 @@
         </w:pict>
       </w:r>
     </w:p>
-    <w:bookmarkEnd w:id="34"/>
     <w:bookmarkEnd w:id="35"/>
-    <w:bookmarkStart w:id="36" w:name="usage-notice"/>
+    <w:bookmarkEnd w:id="36"/>
+    <w:bookmarkStart w:id="37" w:name="usage-notice"/>
     <w:p>
       <w:pPr>
         <w:pStyle w:val="Heading2"/>
@@ -3020,8 +3170,8 @@
         </w:pict>
       </w:r>
     </w:p>
-    <w:bookmarkEnd w:id="36"/>
-    <w:bookmarkStart w:id="37" w:name="frequently-asked-questions"/>
+    <w:bookmarkEnd w:id="37"/>
+    <w:bookmarkStart w:id="38" w:name="frequently-asked-questions"/>
     <w:p>
       <w:pPr>
         <w:pStyle w:val="Heading2"/>
@@ -3325,8 +3475,8 @@
         <w:t xml:space="preserve">An orphan page is a page that no other page on your site links to. Search engines may not discover it reliably, and it receives no internal link value from the rest of your site.</w:t>
       </w:r>
     </w:p>
-    <w:bookmarkEnd w:id="37"/>
     <w:bookmarkEnd w:id="38"/>
+    <w:bookmarkEnd w:id="39"/>
     <w:sectPr>
       <w:footnotePr>
         <w:numRestart w:val="eachSect"/>
@@ -3668,34 +3818,7 @@
     <w:abstractNumId w:val="991"/>
   </w:num>
   <w:num w:numId="1005">
-    <w:abstractNumId w:val="99411"/>
-    <w:lvlOverride w:ilvl="0">
-      <w:startOverride w:val="1"/>
-    </w:lvlOverride>
-    <w:lvlOverride w:ilvl="1">
-      <w:startOverride w:val="1"/>
-    </w:lvlOverride>
-    <w:lvlOverride w:ilvl="2">
-      <w:startOverride w:val="1"/>
-    </w:lvlOverride>
-    <w:lvlOverride w:ilvl="3">
-      <w:startOverride w:val="1"/>
-    </w:lvlOverride>
-    <w:lvlOverride w:ilvl="4">
-      <w:startOverride w:val="1"/>
-    </w:lvlOverride>
-    <w:lvlOverride w:ilvl="5">
-      <w:startOverride w:val="1"/>
-    </w:lvlOverride>
-    <w:lvlOverride w:ilvl="6">
-      <w:startOverride w:val="1"/>
-    </w:lvlOverride>
-    <w:lvlOverride w:ilvl="7">
-      <w:startOverride w:val="1"/>
-    </w:lvlOverride>
-    <w:lvlOverride w:ilvl="8">
-      <w:startOverride w:val="1"/>
-    </w:lvlOverride>
+    <w:abstractNumId w:val="991"/>
   </w:num>
   <w:num w:numId="1006">
     <w:abstractNumId w:val="99411"/>
@@ -3728,9 +3851,39 @@
     </w:lvlOverride>
   </w:num>
   <w:num w:numId="1007">
+    <w:abstractNumId w:val="99411"/>
+    <w:lvlOverride w:ilvl="0">
+      <w:startOverride w:val="1"/>
+    </w:lvlOverride>
+    <w:lvlOverride w:ilvl="1">
+      <w:startOverride w:val="1"/>
+    </w:lvlOverride>
+    <w:lvlOverride w:ilvl="2">
+      <w:startOverride w:val="1"/>
+    </w:lvlOverride>
+    <w:lvlOverride w:ilvl="3">
+      <w:startOverride w:val="1"/>
+    </w:lvlOverride>
+    <w:lvlOverride w:ilvl="4">
+      <w:startOverride w:val="1"/>
+    </w:lvlOverride>
+    <w:lvlOverride w:ilvl="5">
+      <w:startOverride w:val="1"/>
+    </w:lvlOverride>
+    <w:lvlOverride w:ilvl="6">
+      <w:startOverride w:val="1"/>
+    </w:lvlOverride>
+    <w:lvlOverride w:ilvl="7">
+      <w:startOverride w:val="1"/>
+    </w:lvlOverride>
+    <w:lvlOverride w:ilvl="8">
+      <w:startOverride w:val="1"/>
+    </w:lvlOverride>
+  </w:num>
+  <w:num w:numId="1008">
     <w:abstractNumId w:val="991"/>
   </w:num>
-  <w:num w:numId="1008">
+  <w:num w:numId="1009">
     <w:abstractNumId w:val="99411"/>
     <w:lvlOverride w:ilvl="0">
       <w:startOverride w:val="1"/>

</xml_diff>